<commit_message>
Add instructor schedule filtering
</commit_message>
<xml_diff>
--- a/Final_Schedule.docx
+++ b/Final_Schedule.docx
@@ -9,6 +9,15 @@
           <w:sz w:val="32"/>
         </w:rPr>
         <w:t>CLASS SCHEDULE</w:t>
+      </w:r>
+    </w:p>
+    <w:p>
+      <w:r>
+        <w:rPr>
+          <w:b/>
+          <w:sz w:val="24"/>
+        </w:rPr>
+        <w:t>Instructor: All Instructors</w:t>
       </w:r>
     </w:p>
     <w:tbl>

</xml_diff>

<commit_message>
Updated project code, schedule, and README
</commit_message>
<xml_diff>
--- a/Final_Schedule.docx
+++ b/Final_Schedule.docx
@@ -3,49 +3,47 @@
 <w:document xmlns:wpc="http://schemas.microsoft.com/office/word/2010/wordprocessingCanvas" xmlns:mo="http://schemas.microsoft.com/office/mac/office/2008/main" xmlns:mc="http://schemas.openxmlformats.org/markup-compatibility/2006" xmlns:mv="urn:schemas-microsoft-com:mac:vml" xmlns:o="urn:schemas-microsoft-com:office:office" xmlns:r="http://schemas.openxmlformats.org/officeDocument/2006/relationships" xmlns:m="http://schemas.openxmlformats.org/officeDocument/2006/math" xmlns:v="urn:schemas-microsoft-com:vml" xmlns:wp14="http://schemas.microsoft.com/office/word/2010/wordprocessingDrawing" xmlns:wp="http://schemas.openxmlformats.org/drawingml/2006/wordprocessingDrawing" xmlns:w10="urn:schemas-microsoft-com:office:word" xmlns:w="http://schemas.openxmlformats.org/wordprocessingml/2006/main" xmlns:w14="http://schemas.microsoft.com/office/word/2010/wordml" xmlns:wpg="http://schemas.microsoft.com/office/word/2010/wordprocessingGroup" xmlns:wpi="http://schemas.microsoft.com/office/word/2010/wordprocessingInk" xmlns:wne="http://schemas.microsoft.com/office/word/2006/wordml" xmlns:wps="http://schemas.microsoft.com/office/word/2010/wordprocessingShape" mc:Ignorable="w14 wp14">
   <w:body>
     <w:p>
+      <w:pPr>
+        <w:pStyle w:val="Title"/>
+      </w:pPr>
       <w:r>
-        <w:rPr>
-          <w:b/>
-          <w:sz w:val="32"/>
-        </w:rPr>
-        <w:t>CLASS SCHEDULE</w:t>
+        <w:t>FACULTY CLASS SCHEDULE</w:t>
       </w:r>
     </w:p>
     <w:p>
       <w:r>
-        <w:rPr>
-          <w:b/>
-          <w:sz w:val="24"/>
-        </w:rPr>
-        <w:t>Instructor: Appolo Tankeh</w:t>
+        <w:t>Instructor: All Instructors</w:t>
+      </w:r>
+    </w:p>
+    <w:p>
+      <w:pPr>
+        <w:pStyle w:val="Heading1"/>
+      </w:pPr>
+      <w:r>
+        <w:t>TEACHING SCHEDULE</w:t>
       </w:r>
     </w:p>
     <w:tbl>
       <w:tblPr>
         <w:tblStyle w:val="TableGrid"/>
         <w:tblW w:type="auto" w:w="0"/>
-        <w:jc w:val="center"/>
-        <w:tblLayout w:type="fixed"/>
         <w:tblLook w:firstColumn="1" w:firstRow="1" w:lastColumn="0" w:lastRow="0" w:noHBand="0" w:noVBand="1" w:val="04A0"/>
       </w:tblPr>
       <w:tblGrid>
-        <w:gridCol w:w="4896"/>
-        <w:gridCol w:w="4896"/>
-        <w:gridCol w:w="4896"/>
+        <w:gridCol w:w="3600"/>
+        <w:gridCol w:w="3600"/>
+        <w:gridCol w:w="3600"/>
+        <w:gridCol w:w="3600"/>
       </w:tblGrid>
       <w:tr>
         <w:tc>
           <w:tcPr>
-            <w:tcW w:type="dxa" w:w="3744"/>
+            <w:tcW w:type="dxa" w:w="3600"/>
           </w:tcPr>
           <w:p>
-            <w:pPr>
-              <w:jc w:val="center"/>
-            </w:pPr>
             <w:r>
               <w:rPr>
                 <w:b/>
-                <w:sz w:val="24"/>
               </w:rPr>
               <w:t>Course</w:t>
             </w:r>
@@ -53,33 +51,38 @@
         </w:tc>
         <w:tc>
           <w:tcPr>
-            <w:tcW w:type="dxa" w:w="8640"/>
+            <w:tcW w:type="dxa" w:w="3600"/>
           </w:tcPr>
           <w:p>
-            <w:pPr>
-              <w:jc w:val="center"/>
-            </w:pPr>
             <w:r>
               <w:rPr>
                 <w:b/>
-                <w:sz w:val="24"/>
               </w:rPr>
-              <w:t>Times</w:t>
+              <w:t>Instructor</w:t>
             </w:r>
           </w:p>
         </w:tc>
         <w:tc>
           <w:tcPr>
-            <w:tcW w:type="dxa" w:w="1728"/>
+            <w:tcW w:type="dxa" w:w="3600"/>
           </w:tcPr>
           <w:p>
-            <w:pPr>
-              <w:jc w:val="center"/>
-            </w:pPr>
             <w:r>
               <w:rPr>
                 <w:b/>
-                <w:sz w:val="24"/>
+              </w:rPr>
+              <w:t>Schedule</w:t>
+            </w:r>
+          </w:p>
+        </w:tc>
+        <w:tc>
+          <w:tcPr>
+            <w:tcW w:type="dxa" w:w="3600"/>
+          </w:tcPr>
+          <w:p>
+            <w:r>
+              <w:rPr>
+                <w:b/>
               </w:rPr>
               <w:t>Location</w:t>
             </w:r>
@@ -89,80 +92,1642 @@
       <w:tr>
         <w:tc>
           <w:tcPr>
-            <w:tcW w:type="dxa" w:w="3744"/>
-            <w:vAlign w:val="top"/>
+            <w:tcW w:type="dxa" w:w="3600"/>
           </w:tcPr>
           <w:p>
-            <w:pPr>
-              <w:jc w:val="center"/>
-            </w:pPr>
             <w:r>
-              <w:rPr>
-                <w:b/>
-                <w:sz w:val="20"/>
-              </w:rPr>
-              <w:t>CTEC 369</w:t>
-            </w:r>
-            <w:r>
-              <w:rPr>
-                <w:b/>
-                <w:sz w:val="18"/>
-              </w:rPr>
+              <w:t>CTEC 350</w:t>
               <w:br/>
-              <w:t>(Software Engineering)</w:t>
+              <w:t>Prin &amp; Meth of Intru Det &amp; Pre</w:t>
             </w:r>
           </w:p>
         </w:tc>
         <w:tc>
           <w:tcPr>
-            <w:tcW w:type="dxa" w:w="8640"/>
-            <w:vAlign w:val="top"/>
+            <w:tcW w:type="dxa" w:w="3600"/>
           </w:tcPr>
           <w:p>
             <w:r>
-              <w:rPr>
-                <w:b/>
-                <w:sz w:val="20"/>
-              </w:rPr>
-              <w:t>Tuesday &amp; Thursday 9:30 AM to 10:45 AM</w:t>
+              <w:t>Adedoyin, Anthony</w:t>
             </w:r>
           </w:p>
         </w:tc>
         <w:tc>
           <w:tcPr>
-            <w:tcW w:type="dxa" w:w="1728"/>
-            <w:vAlign w:val="top"/>
+            <w:tcW w:type="dxa" w:w="3600"/>
           </w:tcPr>
           <w:p>
-            <w:pPr>
-              <w:jc w:val="center"/>
-            </w:pPr>
             <w:r>
-              <w:rPr>
-                <w:b/>
-                <w:sz w:val="20"/>
-              </w:rPr>
+              <w:t>Monday &amp; Wednesday, 4:00 PM – 6:50 PM</w:t>
+            </w:r>
+          </w:p>
+        </w:tc>
+        <w:tc>
+          <w:tcPr>
+            <w:tcW w:type="dxa" w:w="3600"/>
+          </w:tcPr>
+          <w:p>
+            <w:r>
               <w:t>108</w:t>
             </w:r>
           </w:p>
         </w:tc>
       </w:tr>
+      <w:tr>
+        <w:tc>
+          <w:tcPr>
+            <w:tcW w:type="dxa" w:w="3600"/>
+          </w:tcPr>
+          <w:p>
+            <w:r>
+              <w:t>CTEC 435</w:t>
+              <w:br/>
+              <w:t>UNIX System Administration</w:t>
+            </w:r>
+          </w:p>
+        </w:tc>
+        <w:tc>
+          <w:tcPr>
+            <w:tcW w:type="dxa" w:w="3600"/>
+          </w:tcPr>
+          <w:p>
+            <w:r>
+              <w:t>Ruth Agada</w:t>
+            </w:r>
+          </w:p>
+        </w:tc>
+        <w:tc>
+          <w:tcPr>
+            <w:tcW w:type="dxa" w:w="3600"/>
+          </w:tcPr>
+          <w:p>
+            <w:r>
+              <w:t>Monday &amp; Wednesday, 7:00 PM – 9:50 PM</w:t>
+            </w:r>
+          </w:p>
+        </w:tc>
+        <w:tc>
+          <w:tcPr>
+            <w:tcW w:type="dxa" w:w="3600"/>
+          </w:tcPr>
+          <w:p>
+            <w:r>
+              <w:t>108</w:t>
+            </w:r>
+          </w:p>
+        </w:tc>
+      </w:tr>
+      <w:tr>
+        <w:tc>
+          <w:tcPr>
+            <w:tcW w:type="dxa" w:w="3600"/>
+          </w:tcPr>
+          <w:p>
+            <w:r>
+              <w:t>CTEC 120</w:t>
+              <w:br/>
+              <w:t>Prin of SecureCoding Using Jav</w:t>
+            </w:r>
+          </w:p>
+        </w:tc>
+        <w:tc>
+          <w:tcPr>
+            <w:tcW w:type="dxa" w:w="3600"/>
+          </w:tcPr>
+          <w:p>
+            <w:r>
+              <w:t>Dr. Stone, D. B.</w:t>
+            </w:r>
+          </w:p>
+        </w:tc>
+        <w:tc>
+          <w:tcPr>
+            <w:tcW w:type="dxa" w:w="3600"/>
+          </w:tcPr>
+          <w:p>
+            <w:r>
+              <w:t>Monday &amp; Wednesday, 12:00 PM – 3:15 AM</w:t>
+            </w:r>
+          </w:p>
+        </w:tc>
+        <w:tc>
+          <w:tcPr>
+            <w:tcW w:type="dxa" w:w="3600"/>
+          </w:tcPr>
+          <w:p>
+            <w:r>
+              <w:t>116</w:t>
+            </w:r>
+          </w:p>
+        </w:tc>
+      </w:tr>
+      <w:tr>
+        <w:tc>
+          <w:tcPr>
+            <w:tcW w:type="dxa" w:w="3600"/>
+          </w:tcPr>
+          <w:p>
+            <w:r>
+              <w:t>CTEC 300</w:t>
+              <w:br/>
+              <w:t>Database Achitecture</w:t>
+            </w:r>
+          </w:p>
+        </w:tc>
+        <w:tc>
+          <w:tcPr>
+            <w:tcW w:type="dxa" w:w="3600"/>
+          </w:tcPr>
+          <w:p>
+            <w:r>
+              <w:t>Agboli, P.</w:t>
+            </w:r>
+          </w:p>
+        </w:tc>
+        <w:tc>
+          <w:tcPr>
+            <w:tcW w:type="dxa" w:w="3600"/>
+          </w:tcPr>
+          <w:p>
+            <w:r>
+              <w:t>Monday &amp; Wednesday, 7:00 PM – 9:50 PM</w:t>
+            </w:r>
+          </w:p>
+        </w:tc>
+        <w:tc>
+          <w:tcPr>
+            <w:tcW w:type="dxa" w:w="3600"/>
+          </w:tcPr>
+          <w:p>
+            <w:r>
+              <w:t>112</w:t>
+            </w:r>
+          </w:p>
+        </w:tc>
+      </w:tr>
+      <w:tr>
+        <w:tc>
+          <w:tcPr>
+            <w:tcW w:type="dxa" w:w="3600"/>
+          </w:tcPr>
+          <w:p>
+            <w:r>
+              <w:t>CTEC 214</w:t>
+              <w:br/>
+              <w:t>Client Operating Systs</w:t>
+            </w:r>
+          </w:p>
+        </w:tc>
+        <w:tc>
+          <w:tcPr>
+            <w:tcW w:type="dxa" w:w="3600"/>
+          </w:tcPr>
+          <w:p>
+            <w:r>
+              <w:t>Baptiste, R.</w:t>
+            </w:r>
+          </w:p>
+        </w:tc>
+        <w:tc>
+          <w:tcPr>
+            <w:tcW w:type="dxa" w:w="3600"/>
+          </w:tcPr>
+          <w:p>
+            <w:r>
+              <w:t>Tuesday &amp; Thursday, 12:00 PM – 3:40 PM</w:t>
+            </w:r>
+          </w:p>
+        </w:tc>
+        <w:tc>
+          <w:tcPr>
+            <w:tcW w:type="dxa" w:w="3600"/>
+          </w:tcPr>
+          <w:p>
+            <w:r>
+              <w:t>109</w:t>
+            </w:r>
+          </w:p>
+        </w:tc>
+      </w:tr>
+      <w:tr>
+        <w:tc>
+          <w:tcPr>
+            <w:tcW w:type="dxa" w:w="3600"/>
+          </w:tcPr>
+          <w:p>
+            <w:r>
+              <w:t>CTEC 302</w:t>
+              <w:br/>
+              <w:t>Computer Networking</w:t>
+            </w:r>
+          </w:p>
+        </w:tc>
+        <w:tc>
+          <w:tcPr>
+            <w:tcW w:type="dxa" w:w="3600"/>
+          </w:tcPr>
+          <w:p>
+            <w:r>
+              <w:t>Baptiste, R.</w:t>
+            </w:r>
+          </w:p>
+        </w:tc>
+        <w:tc>
+          <w:tcPr>
+            <w:tcW w:type="dxa" w:w="3600"/>
+          </w:tcPr>
+          <w:p>
+            <w:r>
+              <w:t>Tuesday &amp; Thursday, 4:00 PM – 6:50 PM</w:t>
+            </w:r>
+          </w:p>
+        </w:tc>
+        <w:tc>
+          <w:tcPr>
+            <w:tcW w:type="dxa" w:w="3600"/>
+          </w:tcPr>
+          <w:p>
+            <w:r>
+              <w:t>111</w:t>
+            </w:r>
+          </w:p>
+        </w:tc>
+      </w:tr>
+      <w:tr>
+        <w:tc>
+          <w:tcPr>
+            <w:tcW w:type="dxa" w:w="3600"/>
+          </w:tcPr>
+          <w:p>
+            <w:r>
+              <w:t>CTEC 128</w:t>
+              <w:br/>
+              <w:t>Discrete Structures - Big Data</w:t>
+            </w:r>
+          </w:p>
+        </w:tc>
+        <w:tc>
+          <w:tcPr>
+            <w:tcW w:type="dxa" w:w="3600"/>
+          </w:tcPr>
+          <w:p>
+            <w:r>
+              <w:t>Wilson, Marcella J.</w:t>
+            </w:r>
+          </w:p>
+        </w:tc>
+        <w:tc>
+          <w:tcPr>
+            <w:tcW w:type="dxa" w:w="3600"/>
+          </w:tcPr>
+          <w:p>
+            <w:r>
+              <w:t>Tuesday &amp; Thursday, 4:00 PM – 6:50 PM</w:t>
+            </w:r>
+          </w:p>
+        </w:tc>
+        <w:tc>
+          <w:tcPr>
+            <w:tcW w:type="dxa" w:w="3600"/>
+          </w:tcPr>
+          <w:p>
+            <w:r>
+              <w:t>Online</w:t>
+            </w:r>
+          </w:p>
+        </w:tc>
+      </w:tr>
+      <w:tr>
+        <w:tc>
+          <w:tcPr>
+            <w:tcW w:type="dxa" w:w="3600"/>
+          </w:tcPr>
+          <w:p>
+            <w:r>
+              <w:t>CTEC 298</w:t>
+              <w:br/>
+              <w:t>Symbolic Computation use BigDa</w:t>
+            </w:r>
+          </w:p>
+        </w:tc>
+        <w:tc>
+          <w:tcPr>
+            <w:tcW w:type="dxa" w:w="3600"/>
+          </w:tcPr>
+          <w:p>
+            <w:r>
+              <w:t>Bemley, J</w:t>
+            </w:r>
+          </w:p>
+        </w:tc>
+        <w:tc>
+          <w:tcPr>
+            <w:tcW w:type="dxa" w:w="3600"/>
+          </w:tcPr>
+          <w:p>
+            <w:r>
+              <w:t>Tuesday &amp; Thursday, 4:00 PM – 6:50 PM</w:t>
+            </w:r>
+          </w:p>
+        </w:tc>
+        <w:tc>
+          <w:tcPr>
+            <w:tcW w:type="dxa" w:w="3600"/>
+          </w:tcPr>
+          <w:p>
+            <w:r>
+              <w:t>108</w:t>
+            </w:r>
+          </w:p>
+        </w:tc>
+      </w:tr>
+      <w:tr>
+        <w:tc>
+          <w:tcPr>
+            <w:tcW w:type="dxa" w:w="3600"/>
+          </w:tcPr>
+          <w:p>
+            <w:r>
+              <w:t>CTEC 671</w:t>
+              <w:br/>
+              <w:t>Smart Integrated Systems</w:t>
+            </w:r>
+          </w:p>
+        </w:tc>
+        <w:tc>
+          <w:tcPr>
+            <w:tcW w:type="dxa" w:w="3600"/>
+          </w:tcPr>
+          <w:p>
+            <w:r>
+              <w:t>Bemley, Jesse</w:t>
+            </w:r>
+          </w:p>
+        </w:tc>
+        <w:tc>
+          <w:tcPr>
+            <w:tcW w:type="dxa" w:w="3600"/>
+          </w:tcPr>
+          <w:p>
+            <w:r>
+              <w:t>Tuesday &amp; Thursday, 4:00 PM – 6:50 PM</w:t>
+            </w:r>
+          </w:p>
+        </w:tc>
+        <w:tc>
+          <w:tcPr>
+            <w:tcW w:type="dxa" w:w="3600"/>
+          </w:tcPr>
+          <w:p>
+            <w:r>
+              <w:t>Online</w:t>
+            </w:r>
+          </w:p>
+        </w:tc>
+      </w:tr>
+      <w:tr>
+        <w:tc>
+          <w:tcPr>
+            <w:tcW w:type="dxa" w:w="3600"/>
+          </w:tcPr>
+          <w:p>
+            <w:r>
+              <w:t>CTEC 711</w:t>
+              <w:br/>
+              <w:t>IoT Capstone I</w:t>
+            </w:r>
+          </w:p>
+        </w:tc>
+        <w:tc>
+          <w:tcPr>
+            <w:tcW w:type="dxa" w:w="3600"/>
+          </w:tcPr>
+          <w:p>
+            <w:r>
+              <w:t>Ruth Agada</w:t>
+            </w:r>
+          </w:p>
+        </w:tc>
+        <w:tc>
+          <w:tcPr>
+            <w:tcW w:type="dxa" w:w="3600"/>
+          </w:tcPr>
+          <w:p>
+            <w:r>
+              <w:t>Monday, Wednesday &amp; Friday, 5:00 PM – 5:00 PM</w:t>
+            </w:r>
+          </w:p>
+        </w:tc>
+        <w:tc>
+          <w:tcPr>
+            <w:tcW w:type="dxa" w:w="3600"/>
+          </w:tcPr>
+          <w:p>
+            <w:r>
+              <w:t>Online</w:t>
+            </w:r>
+          </w:p>
+        </w:tc>
+      </w:tr>
+      <w:tr>
+        <w:tc>
+          <w:tcPr>
+            <w:tcW w:type="dxa" w:w="3600"/>
+          </w:tcPr>
+          <w:p>
+            <w:r>
+              <w:t>CTEC 720</w:t>
+              <w:br/>
+              <w:t>Master's Thesis Research I</w:t>
+            </w:r>
+          </w:p>
+        </w:tc>
+        <w:tc>
+          <w:tcPr>
+            <w:tcW w:type="dxa" w:w="3600"/>
+          </w:tcPr>
+          <w:p>
+            <w:r>
+              <w:t>Bright, Marvin</w:t>
+            </w:r>
+          </w:p>
+        </w:tc>
+        <w:tc>
+          <w:tcPr>
+            <w:tcW w:type="dxa" w:w="3600"/>
+          </w:tcPr>
+          <w:p>
+            <w:r>
+              <w:t>Monday &amp; Wednesday, 7:00 PM – 9:50 PM</w:t>
+            </w:r>
+          </w:p>
+        </w:tc>
+        <w:tc>
+          <w:tcPr>
+            <w:tcW w:type="dxa" w:w="3600"/>
+          </w:tcPr>
+          <w:p>
+            <w:r>
+              <w:t>Online</w:t>
+            </w:r>
+          </w:p>
+        </w:tc>
+      </w:tr>
+      <w:tr>
+        <w:tc>
+          <w:tcPr>
+            <w:tcW w:type="dxa" w:w="3600"/>
+          </w:tcPr>
+          <w:p>
+            <w:r>
+              <w:t>CTEC 721</w:t>
+              <w:br/>
+              <w:t>Master's Thesis Research II</w:t>
+            </w:r>
+          </w:p>
+        </w:tc>
+        <w:tc>
+          <w:tcPr>
+            <w:tcW w:type="dxa" w:w="3600"/>
+          </w:tcPr>
+          <w:p>
+            <w:r>
+              <w:t>Bright, Marvin</w:t>
+            </w:r>
+          </w:p>
+        </w:tc>
+        <w:tc>
+          <w:tcPr>
+            <w:tcW w:type="dxa" w:w="3600"/>
+          </w:tcPr>
+          <w:p>
+            <w:r>
+              <w:t>Tuesday &amp; Thursday, 7:00 PM – 9:50 AM</w:t>
+            </w:r>
+          </w:p>
+        </w:tc>
+        <w:tc>
+          <w:tcPr>
+            <w:tcW w:type="dxa" w:w="3600"/>
+          </w:tcPr>
+          <w:p>
+            <w:r>
+              <w:t>Online</w:t>
+            </w:r>
+          </w:p>
+        </w:tc>
+      </w:tr>
+      <w:tr>
+        <w:tc>
+          <w:tcPr>
+            <w:tcW w:type="dxa" w:w="3600"/>
+          </w:tcPr>
+          <w:p>
+            <w:r>
+              <w:t>CTEC 424</w:t>
+              <w:br/>
+              <w:t>Database Administration</w:t>
+            </w:r>
+          </w:p>
+        </w:tc>
+        <w:tc>
+          <w:tcPr>
+            <w:tcW w:type="dxa" w:w="3600"/>
+          </w:tcPr>
+          <w:p>
+            <w:r>
+              <w:t>Carter, Adrian D.</w:t>
+            </w:r>
+          </w:p>
+        </w:tc>
+        <w:tc>
+          <w:tcPr>
+            <w:tcW w:type="dxa" w:w="3600"/>
+          </w:tcPr>
+          <w:p>
+            <w:r>
+              <w:t>Tuesday &amp; Thursday, 7:00 PM – 9:50 PM</w:t>
+            </w:r>
+          </w:p>
+        </w:tc>
+        <w:tc>
+          <w:tcPr>
+            <w:tcW w:type="dxa" w:w="3600"/>
+          </w:tcPr>
+          <w:p>
+            <w:r>
+              <w:t>Online</w:t>
+            </w:r>
+          </w:p>
+        </w:tc>
+      </w:tr>
+      <w:tr>
+        <w:tc>
+          <w:tcPr>
+            <w:tcW w:type="dxa" w:w="3600"/>
+          </w:tcPr>
+          <w:p>
+            <w:r>
+              <w:t>CTEC 445</w:t>
+              <w:br/>
+              <w:t>Fund of Cryptography &amp; Applica</w:t>
+            </w:r>
+          </w:p>
+        </w:tc>
+        <w:tc>
+          <w:tcPr>
+            <w:tcW w:type="dxa" w:w="3600"/>
+          </w:tcPr>
+          <w:p>
+            <w:r>
+              <w:t>Staphord Bengesi</w:t>
+            </w:r>
+          </w:p>
+        </w:tc>
+        <w:tc>
+          <w:tcPr>
+            <w:tcW w:type="dxa" w:w="3600"/>
+          </w:tcPr>
+          <w:p>
+            <w:r>
+              <w:t>Monday &amp; Wednesday, 4:00 PM – 6:50 PM</w:t>
+            </w:r>
+          </w:p>
+        </w:tc>
+        <w:tc>
+          <w:tcPr>
+            <w:tcW w:type="dxa" w:w="3600"/>
+          </w:tcPr>
+          <w:p>
+            <w:r>
+              <w:t>109</w:t>
+            </w:r>
+          </w:p>
+        </w:tc>
+      </w:tr>
+      <w:tr>
+        <w:tc>
+          <w:tcPr>
+            <w:tcW w:type="dxa" w:w="3600"/>
+          </w:tcPr>
+          <w:p>
+            <w:r>
+              <w:t>CTEC 450</w:t>
+              <w:br/>
+              <w:t>Case Studies in Comp Security</w:t>
+            </w:r>
+          </w:p>
+        </w:tc>
+        <w:tc>
+          <w:tcPr>
+            <w:tcW w:type="dxa" w:w="3600"/>
+          </w:tcPr>
+          <w:p>
+            <w:r>
+              <w:t>Loubna Dali</w:t>
+            </w:r>
+          </w:p>
+        </w:tc>
+        <w:tc>
+          <w:tcPr>
+            <w:tcW w:type="dxa" w:w="3600"/>
+          </w:tcPr>
+          <w:p>
+            <w:r>
+              <w:t>Monday &amp; Wednesday, 7:00 PM – 9:50 PM</w:t>
+            </w:r>
+          </w:p>
+        </w:tc>
+        <w:tc>
+          <w:tcPr>
+            <w:tcW w:type="dxa" w:w="3600"/>
+          </w:tcPr>
+          <w:p>
+            <w:r>
+              <w:t>111</w:t>
+            </w:r>
+          </w:p>
+        </w:tc>
+      </w:tr>
+      <w:tr>
+        <w:tc>
+          <w:tcPr>
+            <w:tcW w:type="dxa" w:w="3600"/>
+          </w:tcPr>
+          <w:p>
+            <w:r>
+              <w:t>CTEC 305</w:t>
+              <w:br/>
+              <w:t>Server Administration I</w:t>
+            </w:r>
+          </w:p>
+        </w:tc>
+        <w:tc>
+          <w:tcPr>
+            <w:tcW w:type="dxa" w:w="3600"/>
+          </w:tcPr>
+          <w:p>
+            <w:r>
+              <w:t>Chery, Pierrot</w:t>
+            </w:r>
+          </w:p>
+        </w:tc>
+        <w:tc>
+          <w:tcPr>
+            <w:tcW w:type="dxa" w:w="3600"/>
+          </w:tcPr>
+          <w:p>
+            <w:r>
+              <w:t>Tuesday &amp; Thursday, 4:00 PM – 6:50 PM</w:t>
+            </w:r>
+          </w:p>
+        </w:tc>
+        <w:tc>
+          <w:tcPr>
+            <w:tcW w:type="dxa" w:w="3600"/>
+          </w:tcPr>
+          <w:p>
+            <w:r>
+              <w:t>109</w:t>
+            </w:r>
+          </w:p>
+        </w:tc>
+      </w:tr>
+      <w:tr>
+        <w:tc>
+          <w:tcPr>
+            <w:tcW w:type="dxa" w:w="3600"/>
+          </w:tcPr>
+          <w:p>
+            <w:r>
+              <w:t>CTEC 405</w:t>
+              <w:br/>
+              <w:t>Server Administration II</w:t>
+            </w:r>
+          </w:p>
+        </w:tc>
+        <w:tc>
+          <w:tcPr>
+            <w:tcW w:type="dxa" w:w="3600"/>
+          </w:tcPr>
+          <w:p>
+            <w:r>
+              <w:t>Chery, Pierrot</w:t>
+            </w:r>
+          </w:p>
+        </w:tc>
+        <w:tc>
+          <w:tcPr>
+            <w:tcW w:type="dxa" w:w="3600"/>
+          </w:tcPr>
+          <w:p>
+            <w:r>
+              <w:t>Tuesday &amp; Thursday, 7:00 PM – 9:50 PM</w:t>
+            </w:r>
+          </w:p>
+        </w:tc>
+        <w:tc>
+          <w:tcPr>
+            <w:tcW w:type="dxa" w:w="3600"/>
+          </w:tcPr>
+          <w:p>
+            <w:r>
+              <w:t>109</w:t>
+            </w:r>
+          </w:p>
+        </w:tc>
+      </w:tr>
+      <w:tr>
+        <w:tc>
+          <w:tcPr>
+            <w:tcW w:type="dxa" w:w="3600"/>
+          </w:tcPr>
+          <w:p>
+            <w:r>
+              <w:t>CTEC 226</w:t>
+              <w:br/>
+              <w:t>Intro To Db Development</w:t>
+            </w:r>
+          </w:p>
+        </w:tc>
+        <w:tc>
+          <w:tcPr>
+            <w:tcW w:type="dxa" w:w="3600"/>
+          </w:tcPr>
+          <w:p>
+            <w:r>
+              <w:t>Deal, Shawn</w:t>
+            </w:r>
+          </w:p>
+        </w:tc>
+        <w:tc>
+          <w:tcPr>
+            <w:tcW w:type="dxa" w:w="3600"/>
+          </w:tcPr>
+          <w:p>
+            <w:r>
+              <w:t>Tuesday &amp; Thursday, 7:00 PM – 9:50 PM</w:t>
+            </w:r>
+          </w:p>
+        </w:tc>
+        <w:tc>
+          <w:tcPr>
+            <w:tcW w:type="dxa" w:w="3600"/>
+          </w:tcPr>
+          <w:p>
+            <w:r>
+              <w:t>116</w:t>
+            </w:r>
+          </w:p>
+        </w:tc>
+      </w:tr>
+      <w:tr>
+        <w:tc>
+          <w:tcPr>
+            <w:tcW w:type="dxa" w:w="3600"/>
+          </w:tcPr>
+          <w:p>
+            <w:r>
+              <w:t>CTEC 294</w:t>
+              <w:br/>
+              <w:t>PC Architecture</w:t>
+            </w:r>
+          </w:p>
+        </w:tc>
+        <w:tc>
+          <w:tcPr>
+            <w:tcW w:type="dxa" w:w="3600"/>
+          </w:tcPr>
+          <w:p>
+            <w:r>
+              <w:t>Dixon, Carl</w:t>
+            </w:r>
+          </w:p>
+        </w:tc>
+        <w:tc>
+          <w:tcPr>
+            <w:tcW w:type="dxa" w:w="3600"/>
+          </w:tcPr>
+          <w:p>
+            <w:r>
+              <w:t>Monday &amp; Wednesday, 4:00 PM – 6:50 PM</w:t>
+            </w:r>
+          </w:p>
+        </w:tc>
+        <w:tc>
+          <w:tcPr>
+            <w:tcW w:type="dxa" w:w="3600"/>
+          </w:tcPr>
+          <w:p>
+            <w:r>
+              <w:t>112</w:t>
+            </w:r>
+          </w:p>
+        </w:tc>
+      </w:tr>
+      <w:tr>
+        <w:tc>
+          <w:tcPr>
+            <w:tcW w:type="dxa" w:w="3600"/>
+          </w:tcPr>
+          <w:p>
+            <w:r>
+              <w:t>CTEC 125</w:t>
+              <w:br/>
+              <w:t>Intro to Python programming</w:t>
+            </w:r>
+          </w:p>
+        </w:tc>
+        <w:tc>
+          <w:tcPr>
+            <w:tcW w:type="dxa" w:w="3600"/>
+          </w:tcPr>
+          <w:p>
+            <w:r>
+              <w:t>Dr. Stone, D. B.</w:t>
+            </w:r>
+          </w:p>
+        </w:tc>
+        <w:tc>
+          <w:tcPr>
+            <w:tcW w:type="dxa" w:w="3600"/>
+          </w:tcPr>
+          <w:p>
+            <w:r>
+              <w:t>Online Asynchronous</w:t>
+            </w:r>
+          </w:p>
+        </w:tc>
+        <w:tc>
+          <w:tcPr>
+            <w:tcW w:type="dxa" w:w="3600"/>
+          </w:tcPr>
+          <w:p>
+            <w:r>
+              <w:t>Online</w:t>
+            </w:r>
+          </w:p>
+        </w:tc>
+      </w:tr>
+      <w:tr>
+        <w:tc>
+          <w:tcPr>
+            <w:tcW w:type="dxa" w:w="3600"/>
+          </w:tcPr>
+          <w:p>
+            <w:r>
+              <w:t>CTEC 324</w:t>
+              <w:br/>
+              <w:t>Database Appl Dev</w:t>
+            </w:r>
+          </w:p>
+        </w:tc>
+        <w:tc>
+          <w:tcPr>
+            <w:tcW w:type="dxa" w:w="3600"/>
+          </w:tcPr>
+          <w:p>
+            <w:r>
+              <w:t>Dr. Stone, D. B.</w:t>
+            </w:r>
+          </w:p>
+        </w:tc>
+        <w:tc>
+          <w:tcPr>
+            <w:tcW w:type="dxa" w:w="3600"/>
+          </w:tcPr>
+          <w:p>
+            <w:r>
+              <w:t>Monday &amp; Wednesday, 4:00 PM – 6:50 PM</w:t>
+            </w:r>
+          </w:p>
+        </w:tc>
+        <w:tc>
+          <w:tcPr>
+            <w:tcW w:type="dxa" w:w="3600"/>
+          </w:tcPr>
+          <w:p>
+            <w:r>
+              <w:t>online</w:t>
+            </w:r>
+          </w:p>
+        </w:tc>
+      </w:tr>
+      <w:tr>
+        <w:tc>
+          <w:tcPr>
+            <w:tcW w:type="dxa" w:w="3600"/>
+          </w:tcPr>
+          <w:p>
+            <w:r>
+              <w:t>CTEC 111</w:t>
+              <w:br/>
+              <w:t>Cybersecurity for All</w:t>
+            </w:r>
+          </w:p>
+        </w:tc>
+        <w:tc>
+          <w:tcPr>
+            <w:tcW w:type="dxa" w:w="3600"/>
+          </w:tcPr>
+          <w:p>
+            <w:r>
+              <w:t>Loubna Dali</w:t>
+            </w:r>
+          </w:p>
+        </w:tc>
+        <w:tc>
+          <w:tcPr>
+            <w:tcW w:type="dxa" w:w="3600"/>
+          </w:tcPr>
+          <w:p>
+            <w:r>
+              <w:t>Tuesday &amp; Thursday, 9:00 AM – 11:50 AM</w:t>
+            </w:r>
+          </w:p>
+        </w:tc>
+        <w:tc>
+          <w:tcPr>
+            <w:tcW w:type="dxa" w:w="3600"/>
+          </w:tcPr>
+          <w:p>
+            <w:r>
+              <w:t>Online</w:t>
+            </w:r>
+          </w:p>
+        </w:tc>
+      </w:tr>
+      <w:tr>
+        <w:tc>
+          <w:tcPr>
+            <w:tcW w:type="dxa" w:w="3600"/>
+          </w:tcPr>
+          <w:p>
+            <w:r>
+              <w:t>CTEC 114</w:t>
+              <w:br/>
+              <w:t>Comp Tools &amp; Environ</w:t>
+            </w:r>
+          </w:p>
+        </w:tc>
+        <w:tc>
+          <w:tcPr>
+            <w:tcW w:type="dxa" w:w="3600"/>
+          </w:tcPr>
+          <w:p>
+            <w:r>
+              <w:t>Victoria Lee</w:t>
+            </w:r>
+          </w:p>
+        </w:tc>
+        <w:tc>
+          <w:tcPr>
+            <w:tcW w:type="dxa" w:w="3600"/>
+          </w:tcPr>
+          <w:p>
+            <w:r>
+              <w:t>Monday &amp; Wednesday, 4:00 PM – 6:50 PM</w:t>
+            </w:r>
+          </w:p>
+        </w:tc>
+        <w:tc>
+          <w:tcPr>
+            <w:tcW w:type="dxa" w:w="3600"/>
+          </w:tcPr>
+          <w:p>
+            <w:r>
+              <w:t>116</w:t>
+            </w:r>
+          </w:p>
+        </w:tc>
+      </w:tr>
+      <w:tr>
+        <w:tc>
+          <w:tcPr>
+            <w:tcW w:type="dxa" w:w="3600"/>
+          </w:tcPr>
+          <w:p>
+            <w:r>
+              <w:t>CTEC 475</w:t>
+              <w:br/>
+              <w:t>Cloud Computing</w:t>
+            </w:r>
+          </w:p>
+        </w:tc>
+        <w:tc>
+          <w:tcPr>
+            <w:tcW w:type="dxa" w:w="3600"/>
+          </w:tcPr>
+          <w:p>
+            <w:r>
+              <w:t>Francis, Wilbert R.</w:t>
+            </w:r>
+          </w:p>
+        </w:tc>
+        <w:tc>
+          <w:tcPr>
+            <w:tcW w:type="dxa" w:w="3600"/>
+          </w:tcPr>
+          <w:p>
+            <w:r>
+              <w:t>Monday &amp; Wednesday, 7:00 PM – 9:50 PM</w:t>
+            </w:r>
+          </w:p>
+        </w:tc>
+        <w:tc>
+          <w:tcPr>
+            <w:tcW w:type="dxa" w:w="3600"/>
+          </w:tcPr>
+          <w:p>
+            <w:r>
+              <w:t>114</w:t>
+            </w:r>
+          </w:p>
+        </w:tc>
+      </w:tr>
+      <w:tr>
+        <w:tc>
+          <w:tcPr>
+            <w:tcW w:type="dxa" w:w="3600"/>
+          </w:tcPr>
+          <w:p>
+            <w:r>
+              <w:t>CTEC 393</w:t>
+              <w:br/>
+              <w:t>Internet Prog II</w:t>
+            </w:r>
+          </w:p>
+        </w:tc>
+        <w:tc>
+          <w:tcPr>
+            <w:tcW w:type="dxa" w:w="3600"/>
+          </w:tcPr>
+          <w:p>
+            <w:r>
+              <w:t>Lamar, Courtney</w:t>
+            </w:r>
+          </w:p>
+        </w:tc>
+        <w:tc>
+          <w:tcPr>
+            <w:tcW w:type="dxa" w:w="3600"/>
+          </w:tcPr>
+          <w:p>
+            <w:r>
+              <w:t>Monday &amp; Wednesday, 4:00 PM – 6:50 PM</w:t>
+            </w:r>
+          </w:p>
+        </w:tc>
+        <w:tc>
+          <w:tcPr>
+            <w:tcW w:type="dxa" w:w="3600"/>
+          </w:tcPr>
+          <w:p>
+            <w:r>
+              <w:t>Online</w:t>
+            </w:r>
+          </w:p>
+        </w:tc>
+      </w:tr>
+      <w:tr>
+        <w:tc>
+          <w:tcPr>
+            <w:tcW w:type="dxa" w:w="3600"/>
+          </w:tcPr>
+          <w:p>
+            <w:r>
+              <w:t>CTEC 426</w:t>
+              <w:br/>
+              <w:t>Expert Systems Using Big Data</w:t>
+            </w:r>
+          </w:p>
+        </w:tc>
+        <w:tc>
+          <w:tcPr>
+            <w:tcW w:type="dxa" w:w="3600"/>
+          </w:tcPr>
+          <w:p>
+            <w:r>
+              <w:t>Miller, Stephanie R.</w:t>
+            </w:r>
+          </w:p>
+        </w:tc>
+        <w:tc>
+          <w:tcPr>
+            <w:tcW w:type="dxa" w:w="3600"/>
+          </w:tcPr>
+          <w:p>
+            <w:r>
+              <w:t>Monday &amp; Wednesday, 7:00 PM – 9:50 PM</w:t>
+            </w:r>
+          </w:p>
+        </w:tc>
+        <w:tc>
+          <w:tcPr>
+            <w:tcW w:type="dxa" w:w="3600"/>
+          </w:tcPr>
+          <w:p>
+            <w:r>
+              <w:t>114</w:t>
+            </w:r>
+          </w:p>
+        </w:tc>
+      </w:tr>
+      <w:tr>
+        <w:tc>
+          <w:tcPr>
+            <w:tcW w:type="dxa" w:w="3600"/>
+          </w:tcPr>
+          <w:p>
+            <w:r>
+              <w:t>CTEC 651</w:t>
+              <w:br/>
+              <w:t>Internet of Things of Digital Res</w:t>
+            </w:r>
+          </w:p>
+        </w:tc>
+        <w:tc>
+          <w:tcPr>
+            <w:tcW w:type="dxa" w:w="3600"/>
+          </w:tcPr>
+          <w:p>
+            <w:r>
+              <w:t>Njeh, Felix</w:t>
+            </w:r>
+          </w:p>
+        </w:tc>
+        <w:tc>
+          <w:tcPr>
+            <w:tcW w:type="dxa" w:w="3600"/>
+          </w:tcPr>
+          <w:p>
+            <w:r>
+              <w:t>Monday &amp; Wednesday, 4:00 PM – 6:50 PM</w:t>
+            </w:r>
+          </w:p>
+        </w:tc>
+        <w:tc>
+          <w:tcPr>
+            <w:tcW w:type="dxa" w:w="3600"/>
+          </w:tcPr>
+          <w:p>
+            <w:r>
+              <w:t>Online</w:t>
+            </w:r>
+          </w:p>
+        </w:tc>
+      </w:tr>
+      <w:tr>
+        <w:tc>
+          <w:tcPr>
+            <w:tcW w:type="dxa" w:w="3600"/>
+          </w:tcPr>
+          <w:p>
+            <w:r>
+              <w:t>CTEC 410</w:t>
+              <w:br/>
+              <w:t>Internet Technology</w:t>
+            </w:r>
+          </w:p>
+        </w:tc>
+        <w:tc>
+          <w:tcPr>
+            <w:tcW w:type="dxa" w:w="3600"/>
+          </w:tcPr>
+          <w:p>
+            <w:r>
+              <w:t>Okonofua, Henry</w:t>
+            </w:r>
+          </w:p>
+        </w:tc>
+        <w:tc>
+          <w:tcPr>
+            <w:tcW w:type="dxa" w:w="3600"/>
+          </w:tcPr>
+          <w:p>
+            <w:r>
+              <w:t>Tuesday &amp; Thursday, 4:00 PM – 6:50 PM</w:t>
+            </w:r>
+          </w:p>
+        </w:tc>
+        <w:tc>
+          <w:tcPr>
+            <w:tcW w:type="dxa" w:w="3600"/>
+          </w:tcPr>
+          <w:p>
+            <w:r>
+              <w:t>201</w:t>
+            </w:r>
+          </w:p>
+        </w:tc>
+      </w:tr>
+      <w:tr>
+        <w:tc>
+          <w:tcPr>
+            <w:tcW w:type="dxa" w:w="3600"/>
+          </w:tcPr>
+          <w:p>
+            <w:r>
+              <w:t>CTEC 222</w:t>
+              <w:br/>
+              <w:t>Linux Operating System</w:t>
+            </w:r>
+          </w:p>
+        </w:tc>
+        <w:tc>
+          <w:tcPr>
+            <w:tcW w:type="dxa" w:w="3600"/>
+          </w:tcPr>
+          <w:p>
+            <w:r>
+              <w:t>Roberts, Curtis</w:t>
+            </w:r>
+          </w:p>
+        </w:tc>
+        <w:tc>
+          <w:tcPr>
+            <w:tcW w:type="dxa" w:w="3600"/>
+          </w:tcPr>
+          <w:p>
+            <w:r>
+              <w:t>Tuesday &amp; Thursday, 7:00 PM – 9:50 PM</w:t>
+            </w:r>
+          </w:p>
+        </w:tc>
+        <w:tc>
+          <w:tcPr>
+            <w:tcW w:type="dxa" w:w="3600"/>
+          </w:tcPr>
+          <w:p>
+            <w:r>
+              <w:t>108</w:t>
+            </w:r>
+          </w:p>
+        </w:tc>
+      </w:tr>
+      <w:tr>
+        <w:tc>
+          <w:tcPr>
+            <w:tcW w:type="dxa" w:w="3600"/>
+          </w:tcPr>
+          <w:p>
+            <w:r>
+              <w:t>CTEC 335</w:t>
+              <w:br/>
+              <w:t>Network Protocols</w:t>
+            </w:r>
+          </w:p>
+        </w:tc>
+        <w:tc>
+          <w:tcPr>
+            <w:tcW w:type="dxa" w:w="3600"/>
+          </w:tcPr>
+          <w:p>
+            <w:r>
+              <w:t>Roberts, Curtis</w:t>
+            </w:r>
+          </w:p>
+        </w:tc>
+        <w:tc>
+          <w:tcPr>
+            <w:tcW w:type="dxa" w:w="3600"/>
+          </w:tcPr>
+          <w:p>
+            <w:r>
+              <w:t>Tuesday &amp; Thursday, 4:00 PM – 6:50 PM</w:t>
+            </w:r>
+          </w:p>
+        </w:tc>
+        <w:tc>
+          <w:tcPr>
+            <w:tcW w:type="dxa" w:w="3600"/>
+          </w:tcPr>
+          <w:p>
+            <w:r>
+              <w:t>116</w:t>
+            </w:r>
+          </w:p>
+        </w:tc>
+      </w:tr>
+      <w:tr>
+        <w:tc>
+          <w:tcPr>
+            <w:tcW w:type="dxa" w:w="3600"/>
+          </w:tcPr>
+          <w:p>
+            <w:r>
+              <w:t>CTEC 345</w:t>
+              <w:br/>
+              <w:t>Found of Comp and Network Secu</w:t>
+            </w:r>
+          </w:p>
+        </w:tc>
+        <w:tc>
+          <w:tcPr>
+            <w:tcW w:type="dxa" w:w="3600"/>
+          </w:tcPr>
+          <w:p>
+            <w:r>
+              <w:t>Brett Tolbert</w:t>
+            </w:r>
+          </w:p>
+        </w:tc>
+        <w:tc>
+          <w:tcPr>
+            <w:tcW w:type="dxa" w:w="3600"/>
+          </w:tcPr>
+          <w:p>
+            <w:r>
+              <w:t>Monday &amp; Wednesday, 5:00 PM – 7:50 PM</w:t>
+            </w:r>
+          </w:p>
+        </w:tc>
+        <w:tc>
+          <w:tcPr>
+            <w:tcW w:type="dxa" w:w="3600"/>
+          </w:tcPr>
+          <w:p>
+            <w:r>
+              <w:t>111</w:t>
+            </w:r>
+          </w:p>
+        </w:tc>
+      </w:tr>
+      <w:tr>
+        <w:tc>
+          <w:tcPr>
+            <w:tcW w:type="dxa" w:w="3600"/>
+          </w:tcPr>
+          <w:p>
+            <w:r>
+              <w:t>CTEC 402</w:t>
+              <w:br/>
+              <w:t>Software and OS Security</w:t>
+            </w:r>
+          </w:p>
+        </w:tc>
+        <w:tc>
+          <w:tcPr>
+            <w:tcW w:type="dxa" w:w="3600"/>
+          </w:tcPr>
+          <w:p>
+            <w:r>
+              <w:t>Ruth Agada</w:t>
+            </w:r>
+          </w:p>
+        </w:tc>
+        <w:tc>
+          <w:tcPr>
+            <w:tcW w:type="dxa" w:w="3600"/>
+          </w:tcPr>
+          <w:p>
+            <w:r>
+              <w:t>Monday &amp; Wednesday, 7:00 PM – 9:50 PM</w:t>
+            </w:r>
+          </w:p>
+        </w:tc>
+        <w:tc>
+          <w:tcPr>
+            <w:tcW w:type="dxa" w:w="3600"/>
+          </w:tcPr>
+          <w:p>
+            <w:r>
+              <w:t>Online</w:t>
+            </w:r>
+          </w:p>
+        </w:tc>
+      </w:tr>
+      <w:tr>
+        <w:tc>
+          <w:tcPr>
+            <w:tcW w:type="dxa" w:w="3600"/>
+          </w:tcPr>
+          <w:p>
+            <w:r>
+              <w:t>CTEC 220</w:t>
+              <w:br/>
+              <w:t>Adv Secure Coding Using Java</w:t>
+            </w:r>
+          </w:p>
+        </w:tc>
+        <w:tc>
+          <w:tcPr>
+            <w:tcW w:type="dxa" w:w="3600"/>
+          </w:tcPr>
+          <w:p>
+            <w:r>
+              <w:t>Vega, J.</w:t>
+            </w:r>
+          </w:p>
+        </w:tc>
+        <w:tc>
+          <w:tcPr>
+            <w:tcW w:type="dxa" w:w="3600"/>
+          </w:tcPr>
+          <w:p>
+            <w:r>
+              <w:t>Monday &amp; Wednesday, 11:00 AM – 1:50 PM</w:t>
+            </w:r>
+          </w:p>
+        </w:tc>
+        <w:tc>
+          <w:tcPr>
+            <w:tcW w:type="dxa" w:w="3600"/>
+          </w:tcPr>
+          <w:p>
+            <w:r>
+              <w:t>114</w:t>
+            </w:r>
+          </w:p>
+        </w:tc>
+      </w:tr>
+      <w:tr>
+        <w:tc>
+          <w:tcPr>
+            <w:tcW w:type="dxa" w:w="3600"/>
+          </w:tcPr>
+          <w:p>
+            <w:r>
+              <w:t>CTEC 230</w:t>
+              <w:br/>
+              <w:t>Application of Data Structures</w:t>
+            </w:r>
+          </w:p>
+        </w:tc>
+        <w:tc>
+          <w:tcPr>
+            <w:tcW w:type="dxa" w:w="3600"/>
+          </w:tcPr>
+          <w:p>
+            <w:r>
+              <w:t>Wilson, Marcella J.</w:t>
+            </w:r>
+          </w:p>
+        </w:tc>
+        <w:tc>
+          <w:tcPr>
+            <w:tcW w:type="dxa" w:w="3600"/>
+          </w:tcPr>
+          <w:p>
+            <w:r>
+              <w:t>Tuesday &amp; Thursday, 11:00 AM – 2:40 PM</w:t>
+            </w:r>
+          </w:p>
+        </w:tc>
+        <w:tc>
+          <w:tcPr>
+            <w:tcW w:type="dxa" w:w="3600"/>
+          </w:tcPr>
+          <w:p>
+            <w:r>
+              <w:t>114</w:t>
+            </w:r>
+          </w:p>
+        </w:tc>
+      </w:tr>
+      <w:tr>
+        <w:tc>
+          <w:tcPr>
+            <w:tcW w:type="dxa" w:w="3600"/>
+          </w:tcPr>
+          <w:p>
+            <w:r>
+              <w:t>CTEC 293</w:t>
+              <w:br/>
+              <w:t>Edge Technology</w:t>
+            </w:r>
+          </w:p>
+        </w:tc>
+        <w:tc>
+          <w:tcPr>
+            <w:tcW w:type="dxa" w:w="3600"/>
+          </w:tcPr>
+          <w:p>
+            <w:r>
+              <w:t>Wilson, Marcella J.</w:t>
+            </w:r>
+          </w:p>
+        </w:tc>
+        <w:tc>
+          <w:tcPr>
+            <w:tcW w:type="dxa" w:w="3600"/>
+          </w:tcPr>
+          <w:p>
+            <w:r>
+              <w:t>Monday &amp; Wednesday, 4:00 PM – 6:50 PM</w:t>
+            </w:r>
+          </w:p>
+        </w:tc>
+        <w:tc>
+          <w:tcPr>
+            <w:tcW w:type="dxa" w:w="3600"/>
+          </w:tcPr>
+          <w:p>
+            <w:r>
+              <w:t>114</w:t>
+            </w:r>
+          </w:p>
+        </w:tc>
+      </w:tr>
+      <w:tr>
+        <w:tc>
+          <w:tcPr>
+            <w:tcW w:type="dxa" w:w="3600"/>
+          </w:tcPr>
+          <w:p>
+            <w:r>
+              <w:t>CTEC 415</w:t>
+              <w:br/>
+              <w:t>Edge Computing</w:t>
+            </w:r>
+          </w:p>
+        </w:tc>
+        <w:tc>
+          <w:tcPr>
+            <w:tcW w:type="dxa" w:w="3600"/>
+          </w:tcPr>
+          <w:p>
+            <w:r>
+              <w:t>Wilson, Marcella J.</w:t>
+            </w:r>
+          </w:p>
+        </w:tc>
+        <w:tc>
+          <w:tcPr>
+            <w:tcW w:type="dxa" w:w="3600"/>
+          </w:tcPr>
+          <w:p>
+            <w:r>
+              <w:t>Tuesday &amp; Thursday, 10:00 AM – 12:50 PM</w:t>
+            </w:r>
+          </w:p>
+        </w:tc>
+        <w:tc>
+          <w:tcPr>
+            <w:tcW w:type="dxa" w:w="3600"/>
+          </w:tcPr>
+          <w:p>
+            <w:r>
+              <w:t>114</w:t>
+            </w:r>
+          </w:p>
+        </w:tc>
+      </w:tr>
+      <w:tr>
+        <w:tc>
+          <w:tcPr>
+            <w:tcW w:type="dxa" w:w="3600"/>
+          </w:tcPr>
+          <w:p>
+            <w:r>
+              <w:t>COSC 369</w:t>
+              <w:br/>
+              <w:t>Software Engineering I</w:t>
+            </w:r>
+          </w:p>
+        </w:tc>
+        <w:tc>
+          <w:tcPr>
+            <w:tcW w:type="dxa" w:w="3600"/>
+          </w:tcPr>
+          <w:p>
+            <w:r>
+              <w:t>Dr. Appolo Tankeh</w:t>
+            </w:r>
+          </w:p>
+        </w:tc>
+        <w:tc>
+          <w:tcPr>
+            <w:tcW w:type="dxa" w:w="3600"/>
+          </w:tcPr>
+          <w:p>
+            <w:r>
+              <w:t>Tuesday &amp; Thursday, 9:30 AM – 10:45 AM</w:t>
+            </w:r>
+          </w:p>
+        </w:tc>
+        <w:tc>
+          <w:tcPr>
+            <w:tcW w:type="dxa" w:w="3600"/>
+          </w:tcPr>
+          <w:p>
+            <w:r>
+              <w:t>CS 108</w:t>
+            </w:r>
+          </w:p>
+        </w:tc>
+      </w:tr>
     </w:tbl>
-    <w:p/>
     <w:p>
+      <w:pPr>
+        <w:pStyle w:val="Heading1"/>
+      </w:pPr>
       <w:r>
-        <w:rPr>
-          <w:b/>
-          <w:sz w:val="32"/>
-        </w:rPr>
         <w:t>OFFICE HOURS</w:t>
       </w:r>
     </w:p>
     <w:p>
       <w:r>
-        <w:rPr>
-          <w:b/>
-        </w:rPr>
         <w:t>NOTE: Instructors are not to be interrupted during class times.</w:t>
       </w:r>
     </w:p>
@@ -173,23 +1738,407 @@
         <w:tblLook w:firstColumn="1" w:firstRow="1" w:lastColumn="0" w:lastRow="0" w:noHBand="0" w:noVBand="1" w:val="04A0"/>
       </w:tblPr>
       <w:tblGrid>
-        <w:gridCol w:w="14688"/>
+        <w:gridCol w:w="7200"/>
+        <w:gridCol w:w="7200"/>
       </w:tblGrid>
       <w:tr>
         <w:tc>
           <w:tcPr>
-            <w:tcW w:type="dxa" w:w="14688"/>
+            <w:tcW w:type="dxa" w:w="7200"/>
           </w:tcPr>
           <w:p>
-            <w:pPr>
-              <w:jc w:val="center"/>
-            </w:pPr>
             <w:r>
               <w:rPr>
                 <w:b/>
-                <w:sz w:val="28"/>
               </w:rPr>
-              <w:t>Dr. Appolo Tankeh — Tue/Thursday: 10:45-1pm</w:t>
+              <w:t>Professor</w:t>
+            </w:r>
+          </w:p>
+        </w:tc>
+        <w:tc>
+          <w:tcPr>
+            <w:tcW w:type="dxa" w:w="7200"/>
+          </w:tcPr>
+          <w:p>
+            <w:r>
+              <w:rPr>
+                <w:b/>
+              </w:rPr>
+              <w:t>Office Hours</w:t>
+            </w:r>
+          </w:p>
+        </w:tc>
+      </w:tr>
+      <w:tr>
+        <w:tc>
+          <w:tcPr>
+            <w:tcW w:type="dxa" w:w="7200"/>
+          </w:tcPr>
+          <w:p>
+            <w:r>
+              <w:t>Adedoyin, Anthony</w:t>
+            </w:r>
+          </w:p>
+        </w:tc>
+        <w:tc>
+          <w:tcPr>
+            <w:tcW w:type="dxa" w:w="7200"/>
+          </w:tcPr>
+          <w:p>
+            <w:r>
+              <w:t>Monday: 1:00 PM – 2:30 PM; Wednesday: 1:00 PM – 2:30 PM</w:t>
+            </w:r>
+          </w:p>
+        </w:tc>
+      </w:tr>
+      <w:tr>
+        <w:tc>
+          <w:tcPr>
+            <w:tcW w:type="dxa" w:w="7200"/>
+          </w:tcPr>
+          <w:p>
+            <w:r>
+              <w:t>Agboli, P.</w:t>
+            </w:r>
+          </w:p>
+        </w:tc>
+        <w:tc>
+          <w:tcPr>
+            <w:tcW w:type="dxa" w:w="7200"/>
+          </w:tcPr>
+          <w:p>
+            <w:r>
+              <w:t>Tuesday: 11:00 AM – 12:30 PM; Thursday: 11:00 AM – 12:30 PM</w:t>
+            </w:r>
+          </w:p>
+        </w:tc>
+      </w:tr>
+      <w:tr>
+        <w:tc>
+          <w:tcPr>
+            <w:tcW w:type="dxa" w:w="7200"/>
+          </w:tcPr>
+          <w:p>
+            <w:r>
+              <w:t>Bemley</w:t>
+            </w:r>
+          </w:p>
+        </w:tc>
+        <w:tc>
+          <w:tcPr>
+            <w:tcW w:type="dxa" w:w="7200"/>
+          </w:tcPr>
+          <w:p>
+            <w:r>
+              <w:t>Friday: 10:00 AM – 11:30 AM</w:t>
+            </w:r>
+          </w:p>
+        </w:tc>
+      </w:tr>
+      <w:tr>
+        <w:tc>
+          <w:tcPr>
+            <w:tcW w:type="dxa" w:w="7200"/>
+          </w:tcPr>
+          <w:p>
+            <w:r>
+              <w:t>Bemley, J</w:t>
+            </w:r>
+          </w:p>
+        </w:tc>
+        <w:tc>
+          <w:tcPr>
+            <w:tcW w:type="dxa" w:w="7200"/>
+          </w:tcPr>
+          <w:p>
+            <w:r>
+              <w:t>Monday: 1:00 PM – 2:30 PM; Wednesday: 1:00 PM – 2:30 PM</w:t>
+            </w:r>
+          </w:p>
+        </w:tc>
+      </w:tr>
+      <w:tr>
+        <w:tc>
+          <w:tcPr>
+            <w:tcW w:type="dxa" w:w="7200"/>
+          </w:tcPr>
+          <w:p>
+            <w:r>
+              <w:t>Bright, Marvin</w:t>
+            </w:r>
+          </w:p>
+        </w:tc>
+        <w:tc>
+          <w:tcPr>
+            <w:tcW w:type="dxa" w:w="7200"/>
+          </w:tcPr>
+          <w:p>
+            <w:r>
+              <w:t>Friday: 10:00 AM – 11:30 AM</w:t>
+            </w:r>
+          </w:p>
+        </w:tc>
+      </w:tr>
+      <w:tr>
+        <w:tc>
+          <w:tcPr>
+            <w:tcW w:type="dxa" w:w="7200"/>
+          </w:tcPr>
+          <w:p>
+            <w:r>
+              <w:t>Carter, Adrian D.</w:t>
+            </w:r>
+          </w:p>
+        </w:tc>
+        <w:tc>
+          <w:tcPr>
+            <w:tcW w:type="dxa" w:w="7200"/>
+          </w:tcPr>
+          <w:p>
+            <w:r>
+              <w:t>Monday: 1:00 PM – 2:30 PM; Wednesday: 1:00 PM – 2:30 PM</w:t>
+            </w:r>
+          </w:p>
+        </w:tc>
+      </w:tr>
+      <w:tr>
+        <w:tc>
+          <w:tcPr>
+            <w:tcW w:type="dxa" w:w="7200"/>
+          </w:tcPr>
+          <w:p>
+            <w:r>
+              <w:t>Chery, Pierrot</w:t>
+            </w:r>
+          </w:p>
+        </w:tc>
+        <w:tc>
+          <w:tcPr>
+            <w:tcW w:type="dxa" w:w="7200"/>
+          </w:tcPr>
+          <w:p>
+            <w:r>
+              <w:t>Tuesday: 11:00 AM – 12:30 PM; Thursday: 11:00 AM – 12:30 PM</w:t>
+            </w:r>
+          </w:p>
+        </w:tc>
+      </w:tr>
+      <w:tr>
+        <w:tc>
+          <w:tcPr>
+            <w:tcW w:type="dxa" w:w="7200"/>
+          </w:tcPr>
+          <w:p>
+            <w:r>
+              <w:t>Deal, Shawn</w:t>
+            </w:r>
+          </w:p>
+        </w:tc>
+        <w:tc>
+          <w:tcPr>
+            <w:tcW w:type="dxa" w:w="7200"/>
+          </w:tcPr>
+          <w:p>
+            <w:r>
+              <w:t>Wednesday: 2:00 PM – 3:30 PM</w:t>
+            </w:r>
+          </w:p>
+        </w:tc>
+      </w:tr>
+      <w:tr>
+        <w:tc>
+          <w:tcPr>
+            <w:tcW w:type="dxa" w:w="7200"/>
+          </w:tcPr>
+          <w:p>
+            <w:r>
+              <w:t>Dixon, Carl</w:t>
+            </w:r>
+          </w:p>
+        </w:tc>
+        <w:tc>
+          <w:tcPr>
+            <w:tcW w:type="dxa" w:w="7200"/>
+          </w:tcPr>
+          <w:p>
+            <w:r>
+              <w:t>Friday: 10:00 AM – 11:30 AM</w:t>
+            </w:r>
+          </w:p>
+        </w:tc>
+      </w:tr>
+      <w:tr>
+        <w:tc>
+          <w:tcPr>
+            <w:tcW w:type="dxa" w:w="7200"/>
+          </w:tcPr>
+          <w:p>
+            <w:r>
+              <w:t>Dr. Appolo Tankeh</w:t>
+            </w:r>
+          </w:p>
+        </w:tc>
+        <w:tc>
+          <w:tcPr>
+            <w:tcW w:type="dxa" w:w="7200"/>
+          </w:tcPr>
+          <w:p>
+            <w:r>
+              <w:t>Tuesday: 10:45 AM – 1:00 PM; Thursday: 10:45 AM – 1:00 PM</w:t>
+            </w:r>
+          </w:p>
+        </w:tc>
+      </w:tr>
+      <w:tr>
+        <w:tc>
+          <w:tcPr>
+            <w:tcW w:type="dxa" w:w="7200"/>
+          </w:tcPr>
+          <w:p>
+            <w:r>
+              <w:t>Eugene Harris</w:t>
+            </w:r>
+          </w:p>
+        </w:tc>
+        <w:tc>
+          <w:tcPr>
+            <w:tcW w:type="dxa" w:w="7200"/>
+          </w:tcPr>
+          <w:p>
+            <w:r>
+              <w:t>Tuesday: 11:00 AM – 12:30 PM; Thursday: 11:00 AM – 12:30 PM</w:t>
+            </w:r>
+          </w:p>
+        </w:tc>
+      </w:tr>
+      <w:tr>
+        <w:tc>
+          <w:tcPr>
+            <w:tcW w:type="dxa" w:w="7200"/>
+          </w:tcPr>
+          <w:p>
+            <w:r>
+              <w:t>Eugene T. Harris</w:t>
+            </w:r>
+          </w:p>
+        </w:tc>
+        <w:tc>
+          <w:tcPr>
+            <w:tcW w:type="dxa" w:w="7200"/>
+          </w:tcPr>
+          <w:p>
+            <w:r>
+              <w:t>Wednesday: 2:00 PM – 3:30 PM</w:t>
+            </w:r>
+          </w:p>
+        </w:tc>
+      </w:tr>
+      <w:tr>
+        <w:tc>
+          <w:tcPr>
+            <w:tcW w:type="dxa" w:w="7200"/>
+          </w:tcPr>
+          <w:p>
+            <w:r>
+              <w:t>Francis, Wilbert R.</w:t>
+            </w:r>
+          </w:p>
+        </w:tc>
+        <w:tc>
+          <w:tcPr>
+            <w:tcW w:type="dxa" w:w="7200"/>
+          </w:tcPr>
+          <w:p>
+            <w:r>
+              <w:t>Friday: 10:00 AM – 11:30 AM</w:t>
+            </w:r>
+          </w:p>
+        </w:tc>
+      </w:tr>
+      <w:tr>
+        <w:tc>
+          <w:tcPr>
+            <w:tcW w:type="dxa" w:w="7200"/>
+          </w:tcPr>
+          <w:p>
+            <w:r>
+              <w:t>Henri E. Cooper</w:t>
+            </w:r>
+          </w:p>
+        </w:tc>
+        <w:tc>
+          <w:tcPr>
+            <w:tcW w:type="dxa" w:w="7200"/>
+          </w:tcPr>
+          <w:p>
+            <w:r>
+              <w:t>Monday: 1:00 PM – 2:30 PM; Wednesday: 1:00 PM – 2:30 PM</w:t>
+            </w:r>
+          </w:p>
+        </w:tc>
+      </w:tr>
+      <w:tr>
+        <w:tc>
+          <w:tcPr>
+            <w:tcW w:type="dxa" w:w="7200"/>
+          </w:tcPr>
+          <w:p>
+            <w:r>
+              <w:t>Lamar, Courtney</w:t>
+            </w:r>
+          </w:p>
+        </w:tc>
+        <w:tc>
+          <w:tcPr>
+            <w:tcW w:type="dxa" w:w="7200"/>
+          </w:tcPr>
+          <w:p>
+            <w:r>
+              <w:t>Wednesday: 2:00 PM – 3:30 PM</w:t>
+            </w:r>
+          </w:p>
+        </w:tc>
+      </w:tr>
+      <w:tr>
+        <w:tc>
+          <w:tcPr>
+            <w:tcW w:type="dxa" w:w="7200"/>
+          </w:tcPr>
+          <w:p>
+            <w:r>
+              <w:t>Miller, Stephanie R.</w:t>
+            </w:r>
+          </w:p>
+        </w:tc>
+        <w:tc>
+          <w:tcPr>
+            <w:tcW w:type="dxa" w:w="7200"/>
+          </w:tcPr>
+          <w:p>
+            <w:r>
+              <w:t>Friday: 10:00 AM – 11:30 AM</w:t>
+            </w:r>
+          </w:p>
+        </w:tc>
+      </w:tr>
+      <w:tr>
+        <w:tc>
+          <w:tcPr>
+            <w:tcW w:type="dxa" w:w="7200"/>
+          </w:tcPr>
+          <w:p>
+            <w:r>
+              <w:t>Ruth Agada</w:t>
+            </w:r>
+          </w:p>
+        </w:tc>
+        <w:tc>
+          <w:tcPr>
+            <w:tcW w:type="dxa" w:w="7200"/>
+          </w:tcPr>
+          <w:p>
+            <w:r>
+              <w:t>Wednesday: 2:00 PM – 3:30 PM</w:t>
             </w:r>
           </w:p>
         </w:tc>
@@ -197,7 +2146,7 @@
     </w:tbl>
     <w:sectPr>
       <w:pgSz w:w="15840" w:h="12240" w:orient="landscape"/>
-      <w:pgMar w:top="720" w:right="576" w:bottom="720" w:left="576" w:header="720" w:footer="720" w:gutter="0"/>
+      <w:pgMar w:top="864" w:right="720" w:bottom="864" w:left="720" w:header="720" w:footer="720" w:gutter="0"/>
       <w:cols w:space="720"/>
       <w:docGrid w:linePitch="360"/>
     </w:sectPr>
@@ -568,6 +2517,10 @@
     <w:name w:val="Normal"/>
     <w:qFormat/>
     <w:rsid w:val="00FC693F"/>
+    <w:rPr>
+      <w:rFonts w:ascii="Calibri" w:hAnsi="Calibri"/>
+      <w:sz w:val="20"/>
+    </w:rPr>
   </w:style>
   <w:style w:type="paragraph" w:styleId="Header">
     <w:name w:val="header"/>

</xml_diff>